<commit_message>
updated template and disclosure log
</commit_message>
<xml_diff>
--- a/assets/AI_Disclosure_Log_Template.docx
+++ b/assets/AI_Disclosure_Log_Template.docx
@@ -2775,321 +2775,6 @@
           </w:p>
         </w:tc>
       </w:tr>
-      <w:tr>
-        <w:trPr>
-          <w:cantSplit w:val="0"/>
-          <w:tblHeader w:val="0"/>
-        </w:trPr>
-        <w:tc>
-          <w:tcPr/>
-          <w:p>
-            <w:pPr>
-              <w:rPr/>
-            </w:pPr>
-            <w:r>
-              <w:rPr>
-                <w:rtl w:val="0"/>
-              </w:rPr>
-              <w:t xml:space="preserve">13</w:t>
-            </w:r>
-          </w:p>
-        </w:tc>
-        <w:tc>
-          <w:tcPr/>
-          <w:p>
-            <w:pPr>
-              <w:rPr>
-                <w:color w:val="0000ff"/>
-                <w:sz w:val="20"/>
-                <w:szCs w:val="20"/>
-              </w:rPr>
-            </w:pPr>
-            <w:r>
-              <w:rPr>
-                <w:rtl w:val="0"/>
-              </w:rPr>
-            </w:r>
-          </w:p>
-        </w:tc>
-        <w:tc>
-          <w:tcPr/>
-          <w:p>
-            <w:pPr>
-              <w:rPr>
-                <w:color w:val="0000ff"/>
-                <w:sz w:val="20"/>
-                <w:szCs w:val="20"/>
-              </w:rPr>
-            </w:pPr>
-            <w:r>
-              <w:rPr>
-                <w:rtl w:val="0"/>
-              </w:rPr>
-            </w:r>
-          </w:p>
-        </w:tc>
-        <w:tc>
-          <w:tcPr/>
-          <w:p>
-            <w:pPr>
-              <w:rPr>
-                <w:color w:val="0000ff"/>
-                <w:sz w:val="20"/>
-                <w:szCs w:val="20"/>
-              </w:rPr>
-            </w:pPr>
-            <w:r>
-              <w:rPr>
-                <w:rtl w:val="0"/>
-              </w:rPr>
-            </w:r>
-          </w:p>
-        </w:tc>
-        <w:tc>
-          <w:tcPr/>
-          <w:p>
-            <w:pPr>
-              <w:rPr>
-                <w:color w:val="0000ff"/>
-                <w:sz w:val="20"/>
-                <w:szCs w:val="20"/>
-              </w:rPr>
-            </w:pPr>
-            <w:r>
-              <w:rPr>
-                <w:rtl w:val="0"/>
-              </w:rPr>
-            </w:r>
-          </w:p>
-        </w:tc>
-        <w:tc>
-          <w:tcPr/>
-          <w:p>
-            <w:pPr>
-              <w:rPr>
-                <w:color w:val="0000ff"/>
-                <w:sz w:val="20"/>
-                <w:szCs w:val="20"/>
-              </w:rPr>
-            </w:pPr>
-            <w:r>
-              <w:rPr>
-                <w:rtl w:val="0"/>
-              </w:rPr>
-            </w:r>
-          </w:p>
-        </w:tc>
-      </w:tr>
-      <w:tr>
-        <w:trPr>
-          <w:cantSplit w:val="0"/>
-          <w:tblHeader w:val="0"/>
-        </w:trPr>
-        <w:tc>
-          <w:tcPr/>
-          <w:p>
-            <w:pPr>
-              <w:rPr/>
-            </w:pPr>
-            <w:r>
-              <w:rPr>
-                <w:rtl w:val="0"/>
-              </w:rPr>
-              <w:t xml:space="preserve">14</w:t>
-            </w:r>
-          </w:p>
-        </w:tc>
-        <w:tc>
-          <w:tcPr/>
-          <w:p>
-            <w:pPr>
-              <w:rPr>
-                <w:color w:val="0000ff"/>
-                <w:sz w:val="20"/>
-                <w:szCs w:val="20"/>
-              </w:rPr>
-            </w:pPr>
-            <w:r>
-              <w:rPr>
-                <w:rtl w:val="0"/>
-              </w:rPr>
-            </w:r>
-          </w:p>
-        </w:tc>
-        <w:tc>
-          <w:tcPr/>
-          <w:p>
-            <w:pPr>
-              <w:rPr>
-                <w:color w:val="0000ff"/>
-                <w:sz w:val="20"/>
-                <w:szCs w:val="20"/>
-              </w:rPr>
-            </w:pPr>
-            <w:r>
-              <w:rPr>
-                <w:rtl w:val="0"/>
-              </w:rPr>
-            </w:r>
-          </w:p>
-        </w:tc>
-        <w:tc>
-          <w:tcPr/>
-          <w:p>
-            <w:pPr>
-              <w:rPr>
-                <w:color w:val="0000ff"/>
-                <w:sz w:val="20"/>
-                <w:szCs w:val="20"/>
-              </w:rPr>
-            </w:pPr>
-            <w:r>
-              <w:rPr>
-                <w:rtl w:val="0"/>
-              </w:rPr>
-            </w:r>
-          </w:p>
-        </w:tc>
-        <w:tc>
-          <w:tcPr/>
-          <w:p>
-            <w:pPr>
-              <w:rPr>
-                <w:color w:val="0000ff"/>
-                <w:sz w:val="20"/>
-                <w:szCs w:val="20"/>
-              </w:rPr>
-            </w:pPr>
-            <w:r>
-              <w:rPr>
-                <w:rtl w:val="0"/>
-              </w:rPr>
-            </w:r>
-          </w:p>
-        </w:tc>
-        <w:tc>
-          <w:tcPr/>
-          <w:p>
-            <w:pPr>
-              <w:rPr>
-                <w:color w:val="0000ff"/>
-                <w:sz w:val="20"/>
-                <w:szCs w:val="20"/>
-              </w:rPr>
-            </w:pPr>
-            <w:r>
-              <w:rPr>
-                <w:rtl w:val="0"/>
-              </w:rPr>
-            </w:r>
-          </w:p>
-        </w:tc>
-      </w:tr>
-      <w:tr>
-        <w:trPr>
-          <w:cantSplit w:val="0"/>
-          <w:tblHeader w:val="0"/>
-        </w:trPr>
-        <w:tc>
-          <w:tcPr/>
-          <w:p>
-            <w:pPr>
-              <w:rPr/>
-            </w:pPr>
-            <w:r>
-              <w:rPr>
-                <w:rtl w:val="0"/>
-              </w:rPr>
-              <w:t xml:space="preserve">15</w:t>
-            </w:r>
-          </w:p>
-        </w:tc>
-        <w:tc>
-          <w:tcPr/>
-          <w:p>
-            <w:pPr>
-              <w:rPr>
-                <w:color w:val="0000ff"/>
-                <w:sz w:val="20"/>
-                <w:szCs w:val="20"/>
-              </w:rPr>
-            </w:pPr>
-            <w:r>
-              <w:rPr>
-                <w:rtl w:val="0"/>
-              </w:rPr>
-            </w:r>
-          </w:p>
-        </w:tc>
-        <w:tc>
-          <w:tcPr/>
-          <w:p>
-            <w:pPr>
-              <w:rPr>
-                <w:color w:val="0000ff"/>
-                <w:sz w:val="20"/>
-                <w:szCs w:val="20"/>
-              </w:rPr>
-            </w:pPr>
-            <w:r>
-              <w:rPr>
-                <w:rtl w:val="0"/>
-              </w:rPr>
-            </w:r>
-          </w:p>
-        </w:tc>
-        <w:tc>
-          <w:tcPr/>
-          <w:p>
-            <w:pPr>
-              <w:rPr>
-                <w:color w:val="0000ff"/>
-                <w:sz w:val="20"/>
-                <w:szCs w:val="20"/>
-              </w:rPr>
-            </w:pPr>
-            <w:r>
-              <w:rPr>
-                <w:rtl w:val="0"/>
-              </w:rPr>
-            </w:r>
-          </w:p>
-        </w:tc>
-        <w:tc>
-          <w:tcPr/>
-          <w:p>
-            <w:pPr>
-              <w:rPr>
-                <w:color w:val="0000ff"/>
-                <w:sz w:val="20"/>
-                <w:szCs w:val="20"/>
-              </w:rPr>
-            </w:pPr>
-            <w:r>
-              <w:rPr>
-                <w:rtl w:val="0"/>
-              </w:rPr>
-            </w:r>
-          </w:p>
-        </w:tc>
-        <w:tc>
-          <w:tcPr/>
-          <w:p>
-            <w:pPr>
-              <w:rPr>
-                <w:color w:val="0000ff"/>
-                <w:sz w:val="20"/>
-                <w:szCs w:val="20"/>
-              </w:rPr>
-            </w:pPr>
-            <w:r>
-              <w:rPr>
-                <w:rtl w:val="0"/>
-              </w:rPr>
-            </w:r>
-          </w:p>
-        </w:tc>
-      </w:tr>
     </w:tbl>
     <w:p>
       <w:pPr>
@@ -3170,10 +2855,68 @@
     <w:p>
       <w:pPr>
         <w:pStyle w:val="Heading2"/>
+        <w:spacing w:after="0" w:before="0" w:lineRule="auto"/>
+        <w:rPr>
+          <w:b w:val="0"/>
+          <w:bCs w:val="0"/>
+        </w:rPr>
+      </w:pPr>
+      <w:bookmarkStart w:colFirst="0" w:colLast="0" w:name="_7990ot4zry26" w:id="3"/>
+      <w:bookmarkEnd w:id="3"/>
+      <w:hyperlink r:id="rId6">
+        <w:r>
+          <w:rPr>
+            <w:color w:val="1155cc"/>
+            <w:u w:val="single"/>
+            <w:rtl w:val="0"/>
+          </w:rPr>
+          <w:t xml:space="preserve">How to share chats in Claude</w:t>
+        </w:r>
+      </w:hyperlink>
+      <w:r>
+        <w:rPr>
+          <w:rtl w:val="0"/>
+        </w:rPr>
+      </w:r>
+    </w:p>
+    <w:p>
+      <w:pPr>
+        <w:pStyle w:val="Heading2"/>
+        <w:spacing w:after="0" w:before="0" w:lineRule="auto"/>
         <w:rPr/>
       </w:pPr>
-      <w:bookmarkStart w:colFirst="0" w:colLast="0" w:name="_x3rtdrlrf8s" w:id="3"/>
-      <w:bookmarkEnd w:id="3"/>
+      <w:bookmarkStart w:colFirst="0" w:colLast="0" w:name="_9p5tlahoel7q" w:id="4"/>
+      <w:bookmarkEnd w:id="4"/>
+      <w:hyperlink r:id="rId7">
+        <w:r>
+          <w:rPr>
+            <w:color w:val="1155cc"/>
+            <w:u w:val="single"/>
+            <w:rtl w:val="0"/>
+          </w:rPr>
+          <w:t xml:space="preserve">How to share chats in ChatGPT</w:t>
+        </w:r>
+      </w:hyperlink>
+      <w:r>
+        <w:rPr>
+          <w:rtl w:val="0"/>
+        </w:rPr>
+      </w:r>
+    </w:p>
+    <w:p>
+      <w:pPr>
+        <w:pStyle w:val="Heading2"/>
+        <w:spacing w:after="0" w:before="0" w:lineRule="auto"/>
+        <w:rPr/>
+      </w:pPr>
+      <w:bookmarkStart w:colFirst="0" w:colLast="0" w:name="_4yxdq628icn8" w:id="5"/>
+      <w:bookmarkEnd w:id="5"/>
+      <w:r>
+        <w:rPr>
+          <w:rtl w:val="0"/>
+        </w:rPr>
+        <w:t xml:space="preserve">Warning: if you edit a shared chat after sharing it, you will need to unshare and reshare with a new link or the edits will not show</w:t>
+      </w:r>
       <w:r>
         <w:rPr>
           <w:rtl w:val="0"/>

</xml_diff>